<commit_message>
Update template word count to 3,680
Co-Authored-By: Claude Opus 5.5 <noreply@anthropic.com>
Claude-Session: https://claude.ai/code/session_01SPArV4q8dwhv3Npz3wnuCt
</commit_message>
<xml_diff>
--- a/dpp-textile-jbl/05_cfp_compliance.docx
+++ b/dpp-textile-jbl/05_cfp_compliance.docx
@@ -271,7 +271,7 @@
               <w:jc w:val="left"/>
             </w:pPr>
             <w:r>
-              <w:t xml:space="preserve">Body 2,758 + references 896 =</w:t>
+              <w:t xml:space="preserve">Body 2,784 + references 896 =</w:t>
             </w:r>
             <w:r>
               <w:t xml:space="preserve"> </w:t>
@@ -281,7 +281,7 @@
                 <w:bCs/>
                 <w:b/>
               </w:rPr>
-              <w:t xml:space="preserve">3,654</w:t>
+              <w:t xml:space="preserve">3,680</w:t>
             </w:r>
             <w:r>
               <w:t xml:space="preserve"> </w:t>

</xml_diff>